<commit_message>
updated logs, updated file tracking document, added wireshark findings section to research report
</commit_message>
<xml_diff>
--- a/Research Report v0.1.docx
+++ b/Research Report v0.1.docx
@@ -957,7 +957,7 @@
       <w:pPr>
         <w:pStyle w:val="Heading1"/>
       </w:pPr>
-      <w:bookmarkStart w:id="0" w:name="_Toc239334103"/>
+      <w:bookmarkStart w:id="0" w:name="_Toc242124710"/>
       <w:r>
         <w:lastRenderedPageBreak/>
         <w:t>Executive Summary</w:t>
@@ -969,16 +969,20 @@
         <w:pStyle w:val="TNR"/>
       </w:pPr>
       <w:r>
-        <w:t xml:space="preserve">I love DFIR </w:t>
+        <w:t xml:space="preserve">LLMs </w:t>
       </w:r>
-      <w:proofErr w:type="spellStart"/>
-      <w:r>
-        <w:t>wooo</w:t>
-      </w:r>
-      <w:proofErr w:type="spellEnd"/>
     </w:p>
     <w:sdt>
       <w:sdtPr>
+        <w:rPr>
+          <w:rFonts w:asciiTheme="minorHAnsi" w:eastAsiaTheme="minorHAnsi" w:hAnsiTheme="minorHAnsi" w:cstheme="minorBidi"/>
+          <w:color w:val="auto"/>
+          <w:kern w:val="2"/>
+          <w:sz w:val="24"/>
+          <w:szCs w:val="24"/>
+          <w:lang w:val="en-NZ"/>
+          <w14:ligatures w14:val="standardContextual"/>
+        </w:rPr>
         <w:id w:val="1891150212"/>
         <w:docPartObj>
           <w:docPartGallery w:val="Table of Contents"/>
@@ -987,16 +991,9 @@
       </w:sdtPr>
       <w:sdtEndPr>
         <w:rPr>
-          <w:rFonts w:asciiTheme="minorHAnsi" w:eastAsiaTheme="minorHAnsi" w:hAnsiTheme="minorHAnsi" w:cstheme="minorBidi"/>
           <w:b/>
           <w:bCs/>
           <w:noProof/>
-          <w:color w:val="auto"/>
-          <w:kern w:val="2"/>
-          <w:sz w:val="24"/>
-          <w:szCs w:val="24"/>
-          <w:lang w:val="en-NZ"/>
-          <w14:ligatures w14:val="standardContextual"/>
         </w:rPr>
       </w:sdtEndPr>
       <w:sdtContent>
@@ -1029,7 +1026,7 @@
           <w:r>
             <w:fldChar w:fldCharType="separate"/>
           </w:r>
-          <w:hyperlink w:anchor="_Toc239334103" w:history="1">
+          <w:hyperlink w:anchor="_Toc242124710" w:history="1">
             <w:r>
               <w:rPr>
                 <w:rStyle w:val="Hyperlink"/>
@@ -1056,7 +1053,7 @@
                 <w:noProof/>
                 <w:webHidden/>
               </w:rPr>
-              <w:instrText xml:space="preserve"> PAGEREF _Toc239334103 \h </w:instrText>
+              <w:instrText xml:space="preserve"> PAGEREF _Toc242124710 \h </w:instrText>
             </w:r>
             <w:r>
               <w:rPr>
@@ -1099,7 +1096,7 @@
               <w:lang w:eastAsia="en-NZ"/>
             </w:rPr>
           </w:pPr>
-          <w:hyperlink w:anchor="_Toc239334104" w:history="1">
+          <w:hyperlink w:anchor="_Toc242124711" w:history="1">
             <w:r>
               <w:rPr>
                 <w:rStyle w:val="Hyperlink"/>
@@ -1126,7 +1123,7 @@
                 <w:noProof/>
                 <w:webHidden/>
               </w:rPr>
-              <w:instrText xml:space="preserve"> PAGEREF _Toc239334104 \h </w:instrText>
+              <w:instrText xml:space="preserve"> PAGEREF _Toc242124711 \h </w:instrText>
             </w:r>
             <w:r>
               <w:rPr>
@@ -1169,13 +1166,13 @@
               <w:lang w:eastAsia="en-NZ"/>
             </w:rPr>
           </w:pPr>
-          <w:hyperlink w:anchor="_Toc239334105" w:history="1">
+          <w:hyperlink w:anchor="_Toc242124712" w:history="1">
             <w:r>
               <w:rPr>
                 <w:rStyle w:val="Hyperlink"/>
                 <w:noProof/>
               </w:rPr>
-              <w:t>DFIR</w:t>
+              <w:t>Research Limitations</w:t>
             </w:r>
             <w:r>
               <w:rPr>
@@ -1196,7 +1193,7 @@
                 <w:noProof/>
                 <w:webHidden/>
               </w:rPr>
-              <w:instrText xml:space="preserve"> PAGEREF _Toc239334105 \h </w:instrText>
+              <w:instrText xml:space="preserve"> PAGEREF _Toc242124712 \h </w:instrText>
             </w:r>
             <w:r>
               <w:rPr>
@@ -1239,12 +1236,82 @@
               <w:lang w:eastAsia="en-NZ"/>
             </w:rPr>
           </w:pPr>
-          <w:hyperlink w:anchor="_Toc239334106" w:history="1">
+          <w:hyperlink w:anchor="_Toc242124713" w:history="1">
             <w:r>
               <w:rPr>
                 <w:rStyle w:val="Hyperlink"/>
                 <w:noProof/>
               </w:rPr>
+              <w:t>DFIR</w:t>
+            </w:r>
+            <w:r>
+              <w:rPr>
+                <w:noProof/>
+                <w:webHidden/>
+              </w:rPr>
+              <w:tab/>
+            </w:r>
+            <w:r>
+              <w:rPr>
+                <w:noProof/>
+                <w:webHidden/>
+              </w:rPr>
+              <w:fldChar w:fldCharType="begin"/>
+            </w:r>
+            <w:r>
+              <w:rPr>
+                <w:noProof/>
+                <w:webHidden/>
+              </w:rPr>
+              <w:instrText xml:space="preserve"> PAGEREF _Toc242124713 \h </w:instrText>
+            </w:r>
+            <w:r>
+              <w:rPr>
+                <w:noProof/>
+                <w:webHidden/>
+              </w:rPr>
+            </w:r>
+            <w:r>
+              <w:rPr>
+                <w:noProof/>
+                <w:webHidden/>
+              </w:rPr>
+              <w:fldChar w:fldCharType="separate"/>
+            </w:r>
+            <w:r>
+              <w:rPr>
+                <w:noProof/>
+                <w:webHidden/>
+              </w:rPr>
+              <w:t>2</w:t>
+            </w:r>
+            <w:r>
+              <w:rPr>
+                <w:noProof/>
+                <w:webHidden/>
+              </w:rPr>
+              <w:fldChar w:fldCharType="end"/>
+            </w:r>
+          </w:hyperlink>
+        </w:p>
+        <w:p>
+          <w:pPr>
+            <w:pStyle w:val="TOC2"/>
+            <w:tabs>
+              <w:tab w:val="right" w:leader="dot" w:pos="9016"/>
+            </w:tabs>
+            <w:rPr>
+              <w:rFonts w:eastAsiaTheme="minorEastAsia"/>
+              <w:noProof/>
+              <w:lang w:eastAsia="en-NZ"/>
+            </w:rPr>
+          </w:pPr>
+          <w:hyperlink w:anchor="_Toc242124714" w:history="1">
+            <w:r>
+              <w:rPr>
+                <w:rStyle w:val="Hyperlink"/>
+                <w:noProof/>
+              </w:rPr>
               <w:t>Testing Environment</w:t>
             </w:r>
             <w:r>
@@ -1266,7 +1333,7 @@
                 <w:noProof/>
                 <w:webHidden/>
               </w:rPr>
-              <w:instrText xml:space="preserve"> PAGEREF _Toc239334106 \h </w:instrText>
+              <w:instrText xml:space="preserve"> PAGEREF _Toc242124714 \h </w:instrText>
             </w:r>
             <w:r>
               <w:rPr>
@@ -1309,7 +1376,7 @@
               <w:lang w:eastAsia="en-NZ"/>
             </w:rPr>
           </w:pPr>
-          <w:hyperlink w:anchor="_Toc239334107" w:history="1">
+          <w:hyperlink w:anchor="_Toc242124715" w:history="1">
             <w:r>
               <w:rPr>
                 <w:rStyle w:val="Hyperlink"/>
@@ -1336,7 +1403,7 @@
                 <w:noProof/>
                 <w:webHidden/>
               </w:rPr>
-              <w:instrText xml:space="preserve"> PAGEREF _Toc239334107 \h </w:instrText>
+              <w:instrText xml:space="preserve"> PAGEREF _Toc242124715 \h </w:instrText>
             </w:r>
             <w:r>
               <w:rPr>
@@ -1379,7 +1446,7 @@
               <w:lang w:eastAsia="en-NZ"/>
             </w:rPr>
           </w:pPr>
-          <w:hyperlink w:anchor="_Toc239334108" w:history="1">
+          <w:hyperlink w:anchor="_Toc242124716" w:history="1">
             <w:r>
               <w:rPr>
                 <w:rStyle w:val="Hyperlink"/>
@@ -1406,7 +1473,7 @@
                 <w:noProof/>
                 <w:webHidden/>
               </w:rPr>
-              <w:instrText xml:space="preserve"> PAGEREF _Toc239334108 \h </w:instrText>
+              <w:instrText xml:space="preserve"> PAGEREF _Toc242124716 \h </w:instrText>
             </w:r>
             <w:r>
               <w:rPr>
@@ -1449,7 +1516,7 @@
               <w:lang w:eastAsia="en-NZ"/>
             </w:rPr>
           </w:pPr>
-          <w:hyperlink w:anchor="_Toc239334109" w:history="1">
+          <w:hyperlink w:anchor="_Toc242124717" w:history="1">
             <w:r>
               <w:rPr>
                 <w:rStyle w:val="Hyperlink"/>
@@ -1476,7 +1543,77 @@
                 <w:noProof/>
                 <w:webHidden/>
               </w:rPr>
-              <w:instrText xml:space="preserve"> PAGEREF _Toc239334109 \h </w:instrText>
+              <w:instrText xml:space="preserve"> PAGEREF _Toc242124717 \h </w:instrText>
+            </w:r>
+            <w:r>
+              <w:rPr>
+                <w:noProof/>
+                <w:webHidden/>
+              </w:rPr>
+            </w:r>
+            <w:r>
+              <w:rPr>
+                <w:noProof/>
+                <w:webHidden/>
+              </w:rPr>
+              <w:fldChar w:fldCharType="separate"/>
+            </w:r>
+            <w:r>
+              <w:rPr>
+                <w:noProof/>
+                <w:webHidden/>
+              </w:rPr>
+              <w:t>2</w:t>
+            </w:r>
+            <w:r>
+              <w:rPr>
+                <w:noProof/>
+                <w:webHidden/>
+              </w:rPr>
+              <w:fldChar w:fldCharType="end"/>
+            </w:r>
+          </w:hyperlink>
+        </w:p>
+        <w:p>
+          <w:pPr>
+            <w:pStyle w:val="TOC3"/>
+            <w:tabs>
+              <w:tab w:val="right" w:leader="dot" w:pos="9016"/>
+            </w:tabs>
+            <w:rPr>
+              <w:rFonts w:eastAsiaTheme="minorEastAsia"/>
+              <w:noProof/>
+              <w:lang w:eastAsia="en-NZ"/>
+            </w:rPr>
+          </w:pPr>
+          <w:hyperlink w:anchor="_Toc242124718" w:history="1">
+            <w:r>
+              <w:rPr>
+                <w:rStyle w:val="Hyperlink"/>
+                <w:noProof/>
+              </w:rPr>
+              <w:t>Data Types</w:t>
+            </w:r>
+            <w:r>
+              <w:rPr>
+                <w:noProof/>
+                <w:webHidden/>
+              </w:rPr>
+              <w:tab/>
+            </w:r>
+            <w:r>
+              <w:rPr>
+                <w:noProof/>
+                <w:webHidden/>
+              </w:rPr>
+              <w:fldChar w:fldCharType="begin"/>
+            </w:r>
+            <w:r>
+              <w:rPr>
+                <w:noProof/>
+                <w:webHidden/>
+              </w:rPr>
+              <w:instrText xml:space="preserve"> PAGEREF _Toc242124718 \h </w:instrText>
             </w:r>
             <w:r>
               <w:rPr>
@@ -1519,13 +1656,13 @@
               <w:lang w:eastAsia="en-NZ"/>
             </w:rPr>
           </w:pPr>
-          <w:hyperlink w:anchor="_Toc239334110" w:history="1">
+          <w:hyperlink w:anchor="_Toc242124719" w:history="1">
             <w:r>
               <w:rPr>
                 <w:rStyle w:val="Hyperlink"/>
                 <w:noProof/>
               </w:rPr>
-              <w:t>Limitations</w:t>
+              <w:t>Limitations of humans</w:t>
             </w:r>
             <w:r>
               <w:rPr>
@@ -1546,7 +1683,7 @@
                 <w:noProof/>
                 <w:webHidden/>
               </w:rPr>
-              <w:instrText xml:space="preserve"> PAGEREF _Toc239334110 \h </w:instrText>
+              <w:instrText xml:space="preserve"> PAGEREF _Toc242124719 \h </w:instrText>
             </w:r>
             <w:r>
               <w:rPr>
@@ -1566,7 +1703,77 @@
                 <w:noProof/>
                 <w:webHidden/>
               </w:rPr>
-              <w:t>2</w:t>
+              <w:t>3</w:t>
+            </w:r>
+            <w:r>
+              <w:rPr>
+                <w:noProof/>
+                <w:webHidden/>
+              </w:rPr>
+              <w:fldChar w:fldCharType="end"/>
+            </w:r>
+          </w:hyperlink>
+        </w:p>
+        <w:p>
+          <w:pPr>
+            <w:pStyle w:val="TOC2"/>
+            <w:tabs>
+              <w:tab w:val="right" w:leader="dot" w:pos="9016"/>
+            </w:tabs>
+            <w:rPr>
+              <w:rFonts w:eastAsiaTheme="minorEastAsia"/>
+              <w:noProof/>
+              <w:lang w:eastAsia="en-NZ"/>
+            </w:rPr>
+          </w:pPr>
+          <w:hyperlink w:anchor="_Toc242124720" w:history="1">
+            <w:r>
+              <w:rPr>
+                <w:rStyle w:val="Hyperlink"/>
+                <w:noProof/>
+              </w:rPr>
+              <w:t>Limitations of LLMs</w:t>
+            </w:r>
+            <w:r>
+              <w:rPr>
+                <w:noProof/>
+                <w:webHidden/>
+              </w:rPr>
+              <w:tab/>
+            </w:r>
+            <w:r>
+              <w:rPr>
+                <w:noProof/>
+                <w:webHidden/>
+              </w:rPr>
+              <w:fldChar w:fldCharType="begin"/>
+            </w:r>
+            <w:r>
+              <w:rPr>
+                <w:noProof/>
+                <w:webHidden/>
+              </w:rPr>
+              <w:instrText xml:space="preserve"> PAGEREF _Toc242124720 \h </w:instrText>
+            </w:r>
+            <w:r>
+              <w:rPr>
+                <w:noProof/>
+                <w:webHidden/>
+              </w:rPr>
+            </w:r>
+            <w:r>
+              <w:rPr>
+                <w:noProof/>
+                <w:webHidden/>
+              </w:rPr>
+              <w:fldChar w:fldCharType="separate"/>
+            </w:r>
+            <w:r>
+              <w:rPr>
+                <w:noProof/>
+                <w:webHidden/>
+              </w:rPr>
+              <w:t>3</w:t>
             </w:r>
             <w:r>
               <w:rPr>
@@ -1589,7 +1796,7 @@
               <w:lang w:eastAsia="en-NZ"/>
             </w:rPr>
           </w:pPr>
-          <w:hyperlink w:anchor="_Toc239334111" w:history="1">
+          <w:hyperlink w:anchor="_Toc242124721" w:history="1">
             <w:r>
               <w:rPr>
                 <w:rStyle w:val="Hyperlink"/>
@@ -1616,7 +1823,7 @@
                 <w:noProof/>
                 <w:webHidden/>
               </w:rPr>
-              <w:instrText xml:space="preserve"> PAGEREF _Toc239334111 \h </w:instrText>
+              <w:instrText xml:space="preserve"> PAGEREF _Toc242124721 \h </w:instrText>
             </w:r>
             <w:r>
               <w:rPr>
@@ -1636,7 +1843,7 @@
                 <w:noProof/>
                 <w:webHidden/>
               </w:rPr>
-              <w:t>2</w:t>
+              <w:t>3</w:t>
             </w:r>
             <w:r>
               <w:rPr>
@@ -1659,7 +1866,7 @@
               <w:lang w:eastAsia="en-NZ"/>
             </w:rPr>
           </w:pPr>
-          <w:hyperlink w:anchor="_Toc239334112" w:history="1">
+          <w:hyperlink w:anchor="_Toc242124722" w:history="1">
             <w:r>
               <w:rPr>
                 <w:rStyle w:val="Hyperlink"/>
@@ -1686,7 +1893,7 @@
                 <w:noProof/>
                 <w:webHidden/>
               </w:rPr>
-              <w:instrText xml:space="preserve"> PAGEREF _Toc239334112 \h </w:instrText>
+              <w:instrText xml:space="preserve"> PAGEREF _Toc242124722 \h </w:instrText>
             </w:r>
             <w:r>
               <w:rPr>
@@ -1706,7 +1913,7 @@
                 <w:noProof/>
                 <w:webHidden/>
               </w:rPr>
-              <w:t>2</w:t>
+              <w:t>3</w:t>
             </w:r>
             <w:r>
               <w:rPr>
@@ -1729,7 +1936,7 @@
               <w:lang w:eastAsia="en-NZ"/>
             </w:rPr>
           </w:pPr>
-          <w:hyperlink w:anchor="_Toc239334113" w:history="1">
+          <w:hyperlink w:anchor="_Toc242124723" w:history="1">
             <w:r>
               <w:rPr>
                 <w:rStyle w:val="Hyperlink"/>
@@ -1756,7 +1963,7 @@
                 <w:noProof/>
                 <w:webHidden/>
               </w:rPr>
-              <w:instrText xml:space="preserve"> PAGEREF _Toc239334113 \h </w:instrText>
+              <w:instrText xml:space="preserve"> PAGEREF _Toc242124723 \h </w:instrText>
             </w:r>
             <w:r>
               <w:rPr>
@@ -1776,7 +1983,7 @@
                 <w:noProof/>
                 <w:webHidden/>
               </w:rPr>
-              <w:t>2</w:t>
+              <w:t>3</w:t>
             </w:r>
             <w:r>
               <w:rPr>
@@ -1799,7 +2006,7 @@
               <w:lang w:eastAsia="en-NZ"/>
             </w:rPr>
           </w:pPr>
-          <w:hyperlink w:anchor="_Toc239334114" w:history="1">
+          <w:hyperlink w:anchor="_Toc242124724" w:history="1">
             <w:r>
               <w:rPr>
                 <w:rStyle w:val="Hyperlink"/>
@@ -1826,7 +2033,7 @@
                 <w:noProof/>
                 <w:webHidden/>
               </w:rPr>
-              <w:instrText xml:space="preserve"> PAGEREF _Toc239334114 \h </w:instrText>
+              <w:instrText xml:space="preserve"> PAGEREF _Toc242124724 \h </w:instrText>
             </w:r>
             <w:r>
               <w:rPr>
@@ -1846,7 +2053,7 @@
                 <w:noProof/>
                 <w:webHidden/>
               </w:rPr>
-              <w:t>2</w:t>
+              <w:t>3</w:t>
             </w:r>
             <w:r>
               <w:rPr>
@@ -1869,7 +2076,7 @@
               <w:lang w:eastAsia="en-NZ"/>
             </w:rPr>
           </w:pPr>
-          <w:hyperlink w:anchor="_Toc239334115" w:history="1">
+          <w:hyperlink w:anchor="_Toc242124725" w:history="1">
             <w:r>
               <w:rPr>
                 <w:rStyle w:val="Hyperlink"/>
@@ -1896,7 +2103,7 @@
                 <w:noProof/>
                 <w:webHidden/>
               </w:rPr>
-              <w:instrText xml:space="preserve"> PAGEREF _Toc239334115 \h </w:instrText>
+              <w:instrText xml:space="preserve"> PAGEREF _Toc242124725 \h </w:instrText>
             </w:r>
             <w:r>
               <w:rPr>
@@ -1986,6 +2193,587 @@
     </w:p>
     <w:p>
       <w:pPr>
+        <w:pStyle w:val="Heading1"/>
+      </w:pPr>
+      <w:bookmarkStart w:id="1" w:name="_Toc242124711"/>
+      <w:r>
+        <w:lastRenderedPageBreak/>
+        <w:t>Background</w:t>
+      </w:r>
+      <w:bookmarkEnd w:id="1"/>
+    </w:p>
+    <w:p>
+      <w:pPr>
+        <w:pStyle w:val="Heading2"/>
+      </w:pPr>
+      <w:bookmarkStart w:id="2" w:name="_Toc242124712"/>
+      <w:r>
+        <w:t>Research Limitations</w:t>
+      </w:r>
+      <w:bookmarkEnd w:id="2"/>
+    </w:p>
+    <w:p>
+      <w:pPr>
+        <w:pStyle w:val="TNR"/>
+      </w:pPr>
+      <w:r>
+        <w:t>For this investigation</w:t>
+      </w:r>
+    </w:p>
+    <w:p>
+      <w:pPr>
+        <w:pStyle w:val="Heading2"/>
+      </w:pPr>
+      <w:bookmarkStart w:id="3" w:name="_Toc242124713"/>
+      <w:r>
+        <w:t>DFIR</w:t>
+      </w:r>
+      <w:bookmarkEnd w:id="3"/>
+    </w:p>
+    <w:p/>
+    <w:p>
+      <w:pPr>
+        <w:pStyle w:val="Heading2"/>
+      </w:pPr>
+      <w:bookmarkStart w:id="4" w:name="_Toc242124714"/>
+      <w:r>
+        <w:t>Testing Environment</w:t>
+      </w:r>
+      <w:bookmarkEnd w:id="4"/>
+    </w:p>
+    <w:p>
+      <w:pPr>
+        <w:pStyle w:val="Heading3"/>
+      </w:pPr>
+      <w:bookmarkStart w:id="5" w:name="_Toc242124715"/>
+      <w:r>
+        <w:t>Tools</w:t>
+      </w:r>
+      <w:bookmarkEnd w:id="5"/>
+    </w:p>
+    <w:p/>
+    <w:p>
+      <w:pPr>
+        <w:pStyle w:val="Heading3"/>
+      </w:pPr>
+      <w:bookmarkStart w:id="6" w:name="_Toc242124716"/>
+      <w:r>
+        <w:t>Test Cases</w:t>
+      </w:r>
+      <w:bookmarkEnd w:id="6"/>
+    </w:p>
+    <w:tbl>
+      <w:tblPr>
+        <w:tblStyle w:val="PlainTable5"/>
+        <w:tblW w:w="0" w:type="auto"/>
+        <w:tblLook w:val="04A0" w:firstRow="1" w:lastRow="0" w:firstColumn="1" w:lastColumn="0" w:noHBand="0" w:noVBand="1"/>
+      </w:tblPr>
+      <w:tblGrid>
+        <w:gridCol w:w="1803"/>
+        <w:gridCol w:w="2103"/>
+        <w:gridCol w:w="2583"/>
+        <w:gridCol w:w="2537"/>
+      </w:tblGrid>
+      <w:tr>
+        <w:trPr>
+          <w:cnfStyle w:val="100000000000" w:firstRow="1" w:lastRow="0" w:firstColumn="0" w:lastColumn="0" w:oddVBand="0" w:evenVBand="0" w:oddHBand="0" w:evenHBand="0" w:firstRowFirstColumn="0" w:firstRowLastColumn="0" w:lastRowFirstColumn="0" w:lastRowLastColumn="0"/>
+        </w:trPr>
+        <w:tc>
+          <w:tcPr>
+            <w:cnfStyle w:val="001000000100" w:firstRow="0" w:lastRow="0" w:firstColumn="1" w:lastColumn="0" w:oddVBand="0" w:evenVBand="0" w:oddHBand="0" w:evenHBand="0" w:firstRowFirstColumn="1" w:firstRowLastColumn="0" w:lastRowFirstColumn="0" w:lastRowLastColumn="0"/>
+            <w:tcW w:w="1913" w:type="dxa"/>
+          </w:tcPr>
+          <w:p/>
+        </w:tc>
+        <w:tc>
+          <w:tcPr>
+            <w:tcW w:w="2318" w:type="dxa"/>
+          </w:tcPr>
+          <w:p>
+            <w:pPr>
+              <w:cnfStyle w:val="100000000000" w:firstRow="1" w:lastRow="0" w:firstColumn="0" w:lastColumn="0" w:oddVBand="0" w:evenVBand="0" w:oddHBand="0" w:evenHBand="0" w:firstRowFirstColumn="0" w:firstRowLastColumn="0" w:lastRowFirstColumn="0" w:lastRowLastColumn="0"/>
+              <w:rPr>
+                <w:b/>
+                <w:bCs/>
+              </w:rPr>
+            </w:pPr>
+            <w:r>
+              <w:rPr>
+                <w:b/>
+                <w:bCs/>
+              </w:rPr>
+              <w:t>Foremost</w:t>
+            </w:r>
+          </w:p>
+        </w:tc>
+        <w:tc>
+          <w:tcPr>
+            <w:tcW w:w="2174" w:type="dxa"/>
+          </w:tcPr>
+          <w:p>
+            <w:pPr>
+              <w:cnfStyle w:val="100000000000" w:firstRow="1" w:lastRow="0" w:firstColumn="0" w:lastColumn="0" w:oddVBand="0" w:evenVBand="0" w:oddHBand="0" w:evenHBand="0" w:firstRowFirstColumn="0" w:firstRowLastColumn="0" w:lastRowFirstColumn="0" w:lastRowLastColumn="0"/>
+              <w:rPr>
+                <w:b/>
+                <w:bCs/>
+              </w:rPr>
+            </w:pPr>
+            <w:r>
+              <w:rPr>
+                <w:b/>
+                <w:bCs/>
+              </w:rPr>
+              <w:t>Nmap</w:t>
+            </w:r>
+          </w:p>
+        </w:tc>
+        <w:tc>
+          <w:tcPr>
+            <w:tcW w:w="2611" w:type="dxa"/>
+          </w:tcPr>
+          <w:p>
+            <w:pPr>
+              <w:cnfStyle w:val="100000000000" w:firstRow="1" w:lastRow="0" w:firstColumn="0" w:lastColumn="0" w:oddVBand="0" w:evenVBand="0" w:oddHBand="0" w:evenHBand="0" w:firstRowFirstColumn="0" w:firstRowLastColumn="0" w:lastRowFirstColumn="0" w:lastRowLastColumn="0"/>
+              <w:rPr>
+                <w:b/>
+                <w:bCs/>
+              </w:rPr>
+            </w:pPr>
+            <w:r>
+              <w:rPr>
+                <w:b/>
+                <w:bCs/>
+              </w:rPr>
+              <w:t>Wireshark</w:t>
+            </w:r>
+          </w:p>
+        </w:tc>
+      </w:tr>
+      <w:tr>
+        <w:trPr>
+          <w:cnfStyle w:val="000000100000" w:firstRow="0" w:lastRow="0" w:firstColumn="0" w:lastColumn="0" w:oddVBand="0" w:evenVBand="0" w:oddHBand="1" w:evenHBand="0" w:firstRowFirstColumn="0" w:firstRowLastColumn="0" w:lastRowFirstColumn="0" w:lastRowLastColumn="0"/>
+        </w:trPr>
+        <w:tc>
+          <w:tcPr>
+            <w:cnfStyle w:val="001000000000" w:firstRow="0" w:lastRow="0" w:firstColumn="1" w:lastColumn="0" w:oddVBand="0" w:evenVBand="0" w:oddHBand="0" w:evenHBand="0" w:firstRowFirstColumn="0" w:firstRowLastColumn="0" w:lastRowFirstColumn="0" w:lastRowLastColumn="0"/>
+            <w:tcW w:w="1913" w:type="dxa"/>
+          </w:tcPr>
+          <w:p>
+            <w:pPr>
+              <w:jc w:val="left"/>
+              <w:rPr>
+                <w:b/>
+                <w:bCs/>
+              </w:rPr>
+            </w:pPr>
+            <w:r>
+              <w:rPr>
+                <w:b/>
+                <w:bCs/>
+              </w:rPr>
+              <w:t>File Type</w:t>
+            </w:r>
+          </w:p>
+        </w:tc>
+        <w:tc>
+          <w:tcPr>
+            <w:tcW w:w="2318" w:type="dxa"/>
+          </w:tcPr>
+          <w:p>
+            <w:pPr>
+              <w:cnfStyle w:val="000000100000" w:firstRow="0" w:lastRow="0" w:firstColumn="0" w:lastColumn="0" w:oddVBand="0" w:evenVBand="0" w:oddHBand="1" w:evenHBand="0" w:firstRowFirstColumn="0" w:firstRowLastColumn="0" w:lastRowFirstColumn="0" w:lastRowLastColumn="0"/>
+            </w:pPr>
+            <w:r>
+              <w:t>.DD/.</w:t>
+            </w:r>
+            <w:r>
+              <w:t>TXT</w:t>
+            </w:r>
+          </w:p>
+        </w:tc>
+        <w:tc>
+          <w:tcPr>
+            <w:tcW w:w="2174" w:type="dxa"/>
+          </w:tcPr>
+          <w:p>
+            <w:pPr>
+              <w:cnfStyle w:val="000000100000" w:firstRow="0" w:lastRow="0" w:firstColumn="0" w:lastColumn="0" w:oddVBand="0" w:evenVBand="0" w:oddHBand="1" w:evenHBand="0" w:firstRowFirstColumn="0" w:firstRowLastColumn="0" w:lastRowFirstColumn="0" w:lastRowLastColumn="0"/>
+            </w:pPr>
+            <w:r>
+              <w:t>.</w:t>
+            </w:r>
+            <w:r>
+              <w:t>XML</w:t>
+            </w:r>
+            <w:r>
+              <w:t>/.</w:t>
+            </w:r>
+            <w:r>
+              <w:t>TXT</w:t>
+            </w:r>
+          </w:p>
+        </w:tc>
+        <w:tc>
+          <w:tcPr>
+            <w:tcW w:w="2611" w:type="dxa"/>
+          </w:tcPr>
+          <w:p>
+            <w:pPr>
+              <w:cnfStyle w:val="000000100000" w:firstRow="0" w:lastRow="0" w:firstColumn="0" w:lastColumn="0" w:oddVBand="0" w:evenVBand="0" w:oddHBand="1" w:evenHBand="0" w:firstRowFirstColumn="0" w:firstRowLastColumn="0" w:lastRowFirstColumn="0" w:lastRowLastColumn="0"/>
+            </w:pPr>
+            <w:r>
+              <w:t>.</w:t>
+            </w:r>
+            <w:r>
+              <w:t>PCAP</w:t>
+            </w:r>
+            <w:r>
+              <w:t>/</w:t>
+            </w:r>
+            <w:r>
+              <w:t>NG</w:t>
+            </w:r>
+          </w:p>
+        </w:tc>
+      </w:tr>
+      <w:tr>
+        <w:tc>
+          <w:tcPr>
+            <w:cnfStyle w:val="001000000000" w:firstRow="0" w:lastRow="0" w:firstColumn="1" w:lastColumn="0" w:oddVBand="0" w:evenVBand="0" w:oddHBand="0" w:evenHBand="0" w:firstRowFirstColumn="0" w:firstRowLastColumn="0" w:lastRowFirstColumn="0" w:lastRowLastColumn="0"/>
+            <w:tcW w:w="1913" w:type="dxa"/>
+          </w:tcPr>
+          <w:p>
+            <w:pPr>
+              <w:jc w:val="left"/>
+              <w:rPr>
+                <w:b/>
+                <w:bCs/>
+              </w:rPr>
+            </w:pPr>
+            <w:r>
+              <w:rPr>
+                <w:b/>
+                <w:bCs/>
+              </w:rPr>
+              <w:t>Converted to</w:t>
+            </w:r>
+          </w:p>
+        </w:tc>
+        <w:tc>
+          <w:tcPr>
+            <w:tcW w:w="2318" w:type="dxa"/>
+          </w:tcPr>
+          <w:p>
+            <w:pPr>
+              <w:cnfStyle w:val="000000000000" w:firstRow="0" w:lastRow="0" w:firstColumn="0" w:lastColumn="0" w:oddVBand="0" w:evenVBand="0" w:oddHBand="0" w:evenHBand="0" w:firstRowFirstColumn="0" w:firstRowLastColumn="0" w:lastRowFirstColumn="0" w:lastRowLastColumn="0"/>
+            </w:pPr>
+            <w:r>
+              <w:t>.</w:t>
+            </w:r>
+            <w:r>
+              <w:t>TXT</w:t>
+            </w:r>
+          </w:p>
+        </w:tc>
+        <w:tc>
+          <w:tcPr>
+            <w:tcW w:w="2174" w:type="dxa"/>
+          </w:tcPr>
+          <w:p>
+            <w:pPr>
+              <w:cnfStyle w:val="000000000000" w:firstRow="0" w:lastRow="0" w:firstColumn="0" w:lastColumn="0" w:oddVBand="0" w:evenVBand="0" w:oddHBand="0" w:evenHBand="0" w:firstRowFirstColumn="0" w:firstRowLastColumn="0" w:lastRowFirstColumn="0" w:lastRowLastColumn="0"/>
+            </w:pPr>
+            <w:r>
+              <w:t>.</w:t>
+            </w:r>
+            <w:r>
+              <w:t>TOON</w:t>
+            </w:r>
+          </w:p>
+        </w:tc>
+        <w:tc>
+          <w:tcPr>
+            <w:tcW w:w="2611" w:type="dxa"/>
+          </w:tcPr>
+          <w:p>
+            <w:pPr>
+              <w:cnfStyle w:val="000000000000" w:firstRow="0" w:lastRow="0" w:firstColumn="0" w:lastColumn="0" w:oddVBand="0" w:evenVBand="0" w:oddHBand="0" w:evenHBand="0" w:firstRowFirstColumn="0" w:firstRowLastColumn="0" w:lastRowFirstColumn="0" w:lastRowLastColumn="0"/>
+            </w:pPr>
+            <w:r>
+              <w:t>.</w:t>
+            </w:r>
+            <w:r>
+              <w:t>CSV</w:t>
+            </w:r>
+          </w:p>
+        </w:tc>
+      </w:tr>
+      <w:tr>
+        <w:trPr>
+          <w:cnfStyle w:val="000000100000" w:firstRow="0" w:lastRow="0" w:firstColumn="0" w:lastColumn="0" w:oddVBand="0" w:evenVBand="0" w:oddHBand="1" w:evenHBand="0" w:firstRowFirstColumn="0" w:firstRowLastColumn="0" w:lastRowFirstColumn="0" w:lastRowLastColumn="0"/>
+        </w:trPr>
+        <w:tc>
+          <w:tcPr>
+            <w:cnfStyle w:val="001000000000" w:firstRow="0" w:lastRow="0" w:firstColumn="1" w:lastColumn="0" w:oddVBand="0" w:evenVBand="0" w:oddHBand="0" w:evenHBand="0" w:firstRowFirstColumn="0" w:firstRowLastColumn="0" w:lastRowFirstColumn="0" w:lastRowLastColumn="0"/>
+            <w:tcW w:w="1913" w:type="dxa"/>
+          </w:tcPr>
+          <w:p>
+            <w:pPr>
+              <w:jc w:val="left"/>
+              <w:rPr>
+                <w:b/>
+                <w:bCs/>
+              </w:rPr>
+            </w:pPr>
+            <w:r>
+              <w:rPr>
+                <w:b/>
+                <w:bCs/>
+              </w:rPr>
+              <w:t>Case File 1</w:t>
+            </w:r>
+          </w:p>
+        </w:tc>
+        <w:tc>
+          <w:tcPr>
+            <w:tcW w:w="2318" w:type="dxa"/>
+          </w:tcPr>
+          <w:p>
+            <w:pPr>
+              <w:cnfStyle w:val="000000100000" w:firstRow="0" w:lastRow="0" w:firstColumn="0" w:lastColumn="0" w:oddVBand="0" w:evenVBand="0" w:oddHBand="1" w:evenHBand="0" w:firstRowFirstColumn="0" w:firstRowLastColumn="0" w:lastRowFirstColumn="0" w:lastRowLastColumn="0"/>
+            </w:pPr>
+            <w:r>
+              <w:t>Three.dd</w:t>
+            </w:r>
+          </w:p>
+        </w:tc>
+        <w:tc>
+          <w:tcPr>
+            <w:tcW w:w="2174" w:type="dxa"/>
+          </w:tcPr>
+          <w:p>
+            <w:pPr>
+              <w:cnfStyle w:val="000000100000" w:firstRow="0" w:lastRow="0" w:firstColumn="0" w:lastColumn="0" w:oddVBand="0" w:evenVBand="0" w:oddHBand="1" w:evenHBand="0" w:firstRowFirstColumn="0" w:firstRowLastColumn="0" w:lastRowFirstColumn="0" w:lastRowLastColumn="0"/>
+            </w:pPr>
+            <w:r>
+              <w:t>Nmap_example.xml</w:t>
+            </w:r>
+          </w:p>
+        </w:tc>
+        <w:tc>
+          <w:tcPr>
+            <w:tcW w:w="2611" w:type="dxa"/>
+          </w:tcPr>
+          <w:p>
+            <w:pPr>
+              <w:cnfStyle w:val="000000100000" w:firstRow="0" w:lastRow="0" w:firstColumn="0" w:lastColumn="0" w:oddVBand="0" w:evenVBand="0" w:oddHBand="1" w:evenHBand="0" w:firstRowFirstColumn="0" w:firstRowLastColumn="0" w:lastRowFirstColumn="0" w:lastRowLastColumn="0"/>
+            </w:pPr>
+            <w:r>
+              <w:t>evidence01.pcap</w:t>
+            </w:r>
+          </w:p>
+        </w:tc>
+      </w:tr>
+      <w:tr>
+        <w:tc>
+          <w:tcPr>
+            <w:cnfStyle w:val="001000000000" w:firstRow="0" w:lastRow="0" w:firstColumn="1" w:lastColumn="0" w:oddVBand="0" w:evenVBand="0" w:oddHBand="0" w:evenHBand="0" w:firstRowFirstColumn="0" w:firstRowLastColumn="0" w:lastRowFirstColumn="0" w:lastRowLastColumn="0"/>
+            <w:tcW w:w="1913" w:type="dxa"/>
+          </w:tcPr>
+          <w:p>
+            <w:pPr>
+              <w:jc w:val="left"/>
+              <w:rPr>
+                <w:b/>
+                <w:bCs/>
+              </w:rPr>
+            </w:pPr>
+            <w:r>
+              <w:rPr>
+                <w:b/>
+                <w:bCs/>
+              </w:rPr>
+              <w:t>Case File 2</w:t>
+            </w:r>
+          </w:p>
+        </w:tc>
+        <w:tc>
+          <w:tcPr>
+            <w:tcW w:w="2318" w:type="dxa"/>
+          </w:tcPr>
+          <w:p>
+            <w:pPr>
+              <w:cnfStyle w:val="000000000000" w:firstRow="0" w:lastRow="0" w:firstColumn="0" w:lastColumn="0" w:oddVBand="0" w:evenVBand="0" w:oddHBand="0" w:evenHBand="0" w:firstRowFirstColumn="0" w:firstRowLastColumn="0" w:lastRowFirstColumn="0" w:lastRowLastColumn="0"/>
+            </w:pPr>
+            <w:r>
+              <w:t>EIGHT.dd</w:t>
+            </w:r>
+          </w:p>
+        </w:tc>
+        <w:tc>
+          <w:tcPr>
+            <w:tcW w:w="2174" w:type="dxa"/>
+          </w:tcPr>
+          <w:p>
+            <w:pPr>
+              <w:cnfStyle w:val="000000000000" w:firstRow="0" w:lastRow="0" w:firstColumn="0" w:lastColumn="0" w:oddVBand="0" w:evenVBand="0" w:oddHBand="0" w:evenHBand="0" w:firstRowFirstColumn="0" w:firstRowLastColumn="0" w:lastRowFirstColumn="0" w:lastRowLastColumn="0"/>
+            </w:pPr>
+            <w:r>
+              <w:t>SOITnetworkscan.xml</w:t>
+            </w:r>
+          </w:p>
+        </w:tc>
+        <w:tc>
+          <w:tcPr>
+            <w:tcW w:w="2611" w:type="dxa"/>
+          </w:tcPr>
+          <w:p>
+            <w:pPr>
+              <w:cnfStyle w:val="000000000000" w:firstRow="0" w:lastRow="0" w:firstColumn="0" w:lastColumn="0" w:oddVBand="0" w:evenVBand="0" w:oddHBand="0" w:evenHBand="0" w:firstRowFirstColumn="0" w:firstRowLastColumn="0" w:lastRowFirstColumn="0" w:lastRowLastColumn="0"/>
+            </w:pPr>
+            <w:r>
+              <w:t>evidence02.pcapng</w:t>
+            </w:r>
+          </w:p>
+        </w:tc>
+      </w:tr>
+      <w:tr>
+        <w:trPr>
+          <w:cnfStyle w:val="000000100000" w:firstRow="0" w:lastRow="0" w:firstColumn="0" w:lastColumn="0" w:oddVBand="0" w:evenVBand="0" w:oddHBand="1" w:evenHBand="0" w:firstRowFirstColumn="0" w:firstRowLastColumn="0" w:lastRowFirstColumn="0" w:lastRowLastColumn="0"/>
+        </w:trPr>
+        <w:tc>
+          <w:tcPr>
+            <w:cnfStyle w:val="001000000000" w:firstRow="0" w:lastRow="0" w:firstColumn="1" w:lastColumn="0" w:oddVBand="0" w:evenVBand="0" w:oddHBand="0" w:evenHBand="0" w:firstRowFirstColumn="0" w:firstRowLastColumn="0" w:lastRowFirstColumn="0" w:lastRowLastColumn="0"/>
+            <w:tcW w:w="1913" w:type="dxa"/>
+          </w:tcPr>
+          <w:p>
+            <w:pPr>
+              <w:jc w:val="left"/>
+              <w:rPr>
+                <w:b/>
+                <w:bCs/>
+              </w:rPr>
+            </w:pPr>
+            <w:r>
+              <w:rPr>
+                <w:b/>
+                <w:bCs/>
+              </w:rPr>
+              <w:t>Case File 3</w:t>
+            </w:r>
+          </w:p>
+        </w:tc>
+        <w:tc>
+          <w:tcPr>
+            <w:tcW w:w="2318" w:type="dxa"/>
+          </w:tcPr>
+          <w:p>
+            <w:pPr>
+              <w:cnfStyle w:val="000000100000" w:firstRow="0" w:lastRow="0" w:firstColumn="0" w:lastColumn="0" w:oddVBand="0" w:evenVBand="0" w:oddHBand="1" w:evenHBand="0" w:firstRowFirstColumn="0" w:firstRowLastColumn="0" w:lastRowFirstColumn="0" w:lastRowLastColumn="0"/>
+            </w:pPr>
+            <w:r>
+              <w:t>NINE.dd</w:t>
+            </w:r>
+          </w:p>
+        </w:tc>
+        <w:tc>
+          <w:tcPr>
+            <w:tcW w:w="2174" w:type="dxa"/>
+          </w:tcPr>
+          <w:p>
+            <w:pPr>
+              <w:cnfStyle w:val="000000100000" w:firstRow="0" w:lastRow="0" w:firstColumn="0" w:lastColumn="0" w:oddVBand="0" w:evenVBand="0" w:oddHBand="1" w:evenHBand="0" w:firstRowFirstColumn="0" w:firstRowLastColumn="0" w:lastRowFirstColumn="0" w:lastRowLastColumn="0"/>
+            </w:pPr>
+            <w:r>
+              <w:t>28sepServiceScan.xml</w:t>
+            </w:r>
+          </w:p>
+        </w:tc>
+        <w:tc>
+          <w:tcPr>
+            <w:tcW w:w="2611" w:type="dxa"/>
+          </w:tcPr>
+          <w:p>
+            <w:pPr>
+              <w:cnfStyle w:val="000000100000" w:firstRow="0" w:lastRow="0" w:firstColumn="0" w:lastColumn="0" w:oddVBand="0" w:evenVBand="0" w:oddHBand="1" w:evenHBand="0" w:firstRowFirstColumn="0" w:firstRowLastColumn="0" w:lastRowFirstColumn="0" w:lastRowLastColumn="0"/>
+            </w:pPr>
+            <w:r>
+              <w:t>evidence03.pcap</w:t>
+            </w:r>
+          </w:p>
+        </w:tc>
+      </w:tr>
+    </w:tbl>
+    <w:p/>
+    <w:p>
+      <w:pPr>
+        <w:pStyle w:val="Heading1"/>
+      </w:pPr>
+      <w:bookmarkStart w:id="7" w:name="_Toc242124717"/>
+      <w:r>
+        <w:t>Findings</w:t>
+      </w:r>
+      <w:bookmarkEnd w:id="7"/>
+    </w:p>
+    <w:p>
+      <w:pPr>
+        <w:pStyle w:val="Heading3"/>
+      </w:pPr>
+      <w:bookmarkStart w:id="8" w:name="_Toc242124718"/>
+      <w:r>
+        <w:t>Data Types</w:t>
+      </w:r>
+      <w:bookmarkEnd w:id="8"/>
+    </w:p>
+    <w:p>
+      <w:pPr>
+        <w:pStyle w:val="Heading4"/>
+      </w:pPr>
+      <w:r>
+        <w:t>Foremost</w:t>
+      </w:r>
+    </w:p>
+    <w:p>
+      <w:pPr>
+        <w:pStyle w:val="Heading4"/>
+      </w:pPr>
+      <w:r>
+        <w:t>Nmap</w:t>
+      </w:r>
+    </w:p>
+    <w:p>
+      <w:pPr>
+        <w:pStyle w:val="Heading4"/>
+      </w:pPr>
+      <w:r>
+        <w:t>Wireshark</w:t>
+      </w:r>
+    </w:p>
+    <w:p>
+      <w:pPr>
+        <w:pStyle w:val="TNR"/>
+      </w:pPr>
+      <w:r>
+        <w:t>Wireshark presents the largest investigable datasets in the form of network packet captures. This data includes source/destination IP, frame number</w:t>
+      </w:r>
+      <w:r>
+        <w:t>s</w:t>
+      </w:r>
+      <w:r>
+        <w:t xml:space="preserve">, and info column contents for every single network packet captured, in some datasets numbering in the tens of </w:t>
+      </w:r>
+      <w:r>
+        <w:t>thousands</w:t>
+      </w:r>
+      <w:r>
+        <w:t>. The impact of this was mitigated by exporting the Wireshark packet dissections that would be most relevant to an LLM analyst with “tshark” and feeding that data directly to an Ollama model as a CSV file.</w:t>
+      </w:r>
+      <w:r>
+        <w:t xml:space="preserve"> Ollama and Gemma4 still struggled greatly with the sheer size of input data despite 30k context capacity and prompt chunking, which came out in the quality of the reports. </w:t>
+      </w:r>
+    </w:p>
+    <w:p>
+      <w:pPr>
         <w:pStyle w:val="TNR"/>
       </w:pPr>
     </w:p>
@@ -2006,114 +2794,158 @@
     </w:p>
     <w:p>
       <w:pPr>
-        <w:pStyle w:val="Heading1"/>
+        <w:pStyle w:val="TNR"/>
       </w:pPr>
-      <w:bookmarkStart w:id="1" w:name="_Toc239334104"/>
       <w:r>
         <w:lastRenderedPageBreak/>
-        <w:t>Background</w:t>
+        <w:t xml:space="preserve">In this example below, </w:t>
       </w:r>
-      <w:bookmarkEnd w:id="1"/>
+      <w:r>
+        <w:t>the AI hallucinates the packet range it was explicitly asked for (1) and is unable to fully reassemble a message that appears from the subject typing one character at a time (2), the original message was “iknowyouarewatching” but it fails to identify this</w:t>
+      </w:r>
+      <w:r>
+        <w:t xml:space="preserve">, likely due to the LLM having to keep in mind a large string of </w:t>
+      </w:r>
+      <w:r>
+        <w:t>TCP</w:t>
+      </w:r>
+      <w:r>
+        <w:t xml:space="preserve"> packet data. </w:t>
+      </w:r>
+    </w:p>
+    <w:p>
+      <w:pPr>
+        <w:pStyle w:val="Caption"/>
+        <w:keepNext/>
+        <w:jc w:val="both"/>
+      </w:pPr>
+      <w:r>
+        <w:t xml:space="preserve">Figure </w:t>
+      </w:r>
+      <w:r>
+        <w:fldChar w:fldCharType="begin"/>
+      </w:r>
+      <w:r>
+        <w:instrText xml:space="preserve"> SEQ Figure \* ARABIC </w:instrText>
+      </w:r>
+      <w:r>
+        <w:fldChar w:fldCharType="separate"/>
+      </w:r>
+      <w:r>
+        <w:rPr>
+          <w:noProof/>
+        </w:rPr>
+        <w:t>1</w:t>
+      </w:r>
+      <w:r>
+        <w:fldChar w:fldCharType="end"/>
+      </w:r>
+    </w:p>
+    <w:p>
+      <w:pPr>
+        <w:pStyle w:val="TNR"/>
+      </w:pPr>
+      <w:r>
+        <w:drawing>
+          <wp:inline distT="0" distB="0" distL="0" distR="0" wp14:anchorId="15797118" wp14:editId="210B2ABB">
+            <wp:extent cx="5731510" cy="5422900"/>
+            <wp:effectExtent l="0" t="0" r="2540" b="6350"/>
+            <wp:docPr id="745658143" name="Picture 1"/>
+            <wp:cNvGraphicFramePr>
+              <a:graphicFrameLocks xmlns:a="http://schemas.openxmlformats.org/drawingml/2006/main" noChangeAspect="1"/>
+            </wp:cNvGraphicFramePr>
+            <a:graphic xmlns:a="http://schemas.openxmlformats.org/drawingml/2006/main">
+              <a:graphicData uri="http://schemas.openxmlformats.org/drawingml/2006/picture">
+                <pic:pic xmlns:pic="http://schemas.openxmlformats.org/drawingml/2006/picture">
+                  <pic:nvPicPr>
+                    <pic:cNvPr id="745658143" name=""/>
+                    <pic:cNvPicPr/>
+                  </pic:nvPicPr>
+                  <pic:blipFill>
+                    <a:blip r:embed="rId8"/>
+                    <a:stretch>
+                      <a:fillRect/>
+                    </a:stretch>
+                  </pic:blipFill>
+                  <pic:spPr>
+                    <a:xfrm>
+                      <a:off x="0" y="0"/>
+                      <a:ext cx="5731510" cy="5422900"/>
+                    </a:xfrm>
+                    <a:prstGeom prst="rect">
+                      <a:avLst/>
+                    </a:prstGeom>
+                  </pic:spPr>
+                </pic:pic>
+              </a:graphicData>
+            </a:graphic>
+          </wp:inline>
+        </w:drawing>
+      </w:r>
     </w:p>
     <w:p>
       <w:pPr>
         <w:pStyle w:val="Heading2"/>
       </w:pPr>
-      <w:bookmarkStart w:id="2" w:name="_Toc239334105"/>
+      <w:bookmarkStart w:id="9" w:name="_Toc242124719"/>
       <w:r>
-        <w:t>DFIR</w:t>
+        <w:lastRenderedPageBreak/>
+        <w:t>Limitations of humans</w:t>
       </w:r>
-      <w:bookmarkEnd w:id="2"/>
+      <w:bookmarkEnd w:id="9"/>
     </w:p>
     <w:p>
       <w:pPr>
         <w:pStyle w:val="Heading2"/>
       </w:pPr>
-      <w:bookmarkStart w:id="3" w:name="_Toc239334106"/>
+      <w:bookmarkStart w:id="10" w:name="_Toc242124720"/>
       <w:r>
-        <w:t>Testing Environment</w:t>
+        <w:t>Limitations</w:t>
       </w:r>
-      <w:bookmarkEnd w:id="3"/>
+      <w:r>
+        <w:t xml:space="preserve"> of LLMs</w:t>
+      </w:r>
+      <w:bookmarkEnd w:id="10"/>
     </w:p>
     <w:p>
       <w:pPr>
         <w:pStyle w:val="Heading3"/>
       </w:pPr>
-      <w:bookmarkStart w:id="4" w:name="_Toc239334107"/>
+      <w:bookmarkStart w:id="11" w:name="_Toc242124721"/>
       <w:r>
-        <w:t>Tools</w:t>
+        <w:t>Foremost</w:t>
       </w:r>
-      <w:bookmarkEnd w:id="4"/>
+      <w:bookmarkEnd w:id="11"/>
     </w:p>
     <w:p>
       <w:pPr>
         <w:pStyle w:val="Heading3"/>
       </w:pPr>
-      <w:bookmarkStart w:id="5" w:name="_Toc239334108"/>
+      <w:bookmarkStart w:id="12" w:name="_Toc242124722"/>
       <w:r>
-        <w:t>Test Cases</w:t>
+        <w:t>Nmap</w:t>
       </w:r>
-      <w:bookmarkEnd w:id="5"/>
+      <w:bookmarkEnd w:id="12"/>
+    </w:p>
+    <w:p>
+      <w:pPr>
+        <w:pStyle w:val="Heading3"/>
+      </w:pPr>
+      <w:bookmarkStart w:id="13" w:name="_Toc242124723"/>
+      <w:r>
+        <w:t>Wireshark</w:t>
+      </w:r>
+      <w:bookmarkEnd w:id="13"/>
     </w:p>
     <w:p>
       <w:pPr>
         <w:pStyle w:val="Heading1"/>
       </w:pPr>
-      <w:bookmarkStart w:id="6" w:name="_Toc239334109"/>
-      <w:r>
-        <w:t>Findings</w:t>
-      </w:r>
-      <w:bookmarkEnd w:id="6"/>
-    </w:p>
-    <w:p>
-      <w:pPr>
-        <w:pStyle w:val="Heading2"/>
-      </w:pPr>
-      <w:bookmarkStart w:id="7" w:name="_Toc239334110"/>
-      <w:r>
-        <w:t>Limitations</w:t>
-      </w:r>
-      <w:bookmarkEnd w:id="7"/>
-    </w:p>
-    <w:p>
-      <w:pPr>
-        <w:pStyle w:val="Heading3"/>
-      </w:pPr>
-      <w:bookmarkStart w:id="8" w:name="_Toc239334111"/>
-      <w:r>
-        <w:t>Foremost</w:t>
-      </w:r>
-      <w:bookmarkEnd w:id="8"/>
-    </w:p>
-    <w:p>
-      <w:pPr>
-        <w:pStyle w:val="Heading3"/>
-      </w:pPr>
-      <w:bookmarkStart w:id="9" w:name="_Toc239334112"/>
-      <w:r>
-        <w:t>Nmap</w:t>
-      </w:r>
-      <w:bookmarkEnd w:id="9"/>
-    </w:p>
-    <w:p>
-      <w:pPr>
-        <w:pStyle w:val="Heading3"/>
-      </w:pPr>
-      <w:bookmarkStart w:id="10" w:name="_Toc239334113"/>
-      <w:r>
-        <w:t>Wireshark</w:t>
-      </w:r>
-      <w:bookmarkEnd w:id="10"/>
-    </w:p>
-    <w:p>
-      <w:pPr>
-        <w:pStyle w:val="Heading1"/>
-      </w:pPr>
-      <w:bookmarkStart w:id="11" w:name="_Toc239334114"/>
+      <w:bookmarkStart w:id="14" w:name="_Toc242124724"/>
       <w:r>
         <w:t>Recommendations</w:t>
       </w:r>
-      <w:bookmarkEnd w:id="11"/>
+      <w:bookmarkEnd w:id="14"/>
     </w:p>
     <w:p/>
     <w:p/>
@@ -2127,23 +2959,21 @@
     <w:p/>
     <w:p/>
     <w:p/>
-    <w:bookmarkStart w:id="12" w:name="_Toc239334115" w:displacedByCustomXml="next"/>
+    <w:bookmarkStart w:id="15" w:name="_Toc242124725" w:displacedByCustomXml="next"/>
     <w:sdt>
       <w:sdtPr>
+        <w:rPr>
+          <w:rFonts w:asciiTheme="minorHAnsi" w:eastAsiaTheme="minorHAnsi" w:hAnsiTheme="minorHAnsi" w:cstheme="minorBidi"/>
+          <w:color w:val="auto"/>
+          <w:sz w:val="24"/>
+          <w:szCs w:val="24"/>
+        </w:rPr>
         <w:id w:val="-1257742060"/>
         <w:docPartObj>
           <w:docPartGallery w:val="Bibliographies"/>
           <w:docPartUnique/>
         </w:docPartObj>
       </w:sdtPr>
-      <w:sdtEndPr>
-        <w:rPr>
-          <w:rFonts w:asciiTheme="minorHAnsi" w:eastAsiaTheme="minorHAnsi" w:hAnsiTheme="minorHAnsi" w:cstheme="minorBidi"/>
-          <w:color w:val="auto"/>
-          <w:sz w:val="24"/>
-          <w:szCs w:val="24"/>
-        </w:rPr>
-      </w:sdtEndPr>
       <w:sdtContent>
         <w:p>
           <w:pPr>
@@ -2152,7 +2982,7 @@
           <w:r>
             <w:t>References</w:t>
           </w:r>
-          <w:bookmarkEnd w:id="12"/>
+          <w:bookmarkEnd w:id="15"/>
         </w:p>
         <w:sdt>
           <w:sdtPr>
@@ -2194,7 +3024,7 @@
     </w:sdt>
     <w:p/>
     <w:sectPr>
-      <w:headerReference w:type="default" r:id="rId8"/>
+      <w:headerReference w:type="default" r:id="rId9"/>
       <w:pgSz w:w="11906" w:h="16838"/>
       <w:pgMar w:top="1440" w:right="1440" w:bottom="1440" w:left="1440" w:header="708" w:footer="708" w:gutter="0"/>
       <w:pgNumType w:start="0"/>
@@ -2780,7 +3610,6 @@
     <w:next w:val="Normal"/>
     <w:link w:val="Heading4Char"/>
     <w:uiPriority w:val="9"/>
-    <w:semiHidden/>
     <w:unhideWhenUsed/>
     <w:qFormat/>
     <w:rsid w:val="00BB61DE"/>
@@ -3023,7 +3852,6 @@
     <w:basedOn w:val="DefaultParagraphFont"/>
     <w:link w:val="Heading4"/>
     <w:uiPriority w:val="9"/>
-    <w:semiHidden/>
     <w:rsid w:val="00BB61DE"/>
     <w:rPr>
       <w:rFonts w:eastAsiaTheme="majorEastAsia" w:cstheme="majorBidi"/>
@@ -3412,6 +4240,276 @@
       <w:spacing w:after="100"/>
       <w:ind w:left="480"/>
     </w:pPr>
+  </w:style>
+  <w:style w:type="table" w:styleId="TableGrid">
+    <w:name w:val="Table Grid"/>
+    <w:basedOn w:val="TableNormal"/>
+    <w:uiPriority w:val="39"/>
+    <w:rsid w:val="00CD778B"/>
+    <w:pPr>
+      <w:spacing w:after="0" w:line="240" w:lineRule="auto"/>
+    </w:pPr>
+    <w:tblPr>
+      <w:tblBorders>
+        <w:top w:val="single" w:sz="4" w:space="0" w:color="auto"/>
+        <w:left w:val="single" w:sz="4" w:space="0" w:color="auto"/>
+        <w:bottom w:val="single" w:sz="4" w:space="0" w:color="auto"/>
+        <w:right w:val="single" w:sz="4" w:space="0" w:color="auto"/>
+        <w:insideH w:val="single" w:sz="4" w:space="0" w:color="auto"/>
+        <w:insideV w:val="single" w:sz="4" w:space="0" w:color="auto"/>
+      </w:tblBorders>
+    </w:tblPr>
+  </w:style>
+  <w:style w:type="table" w:styleId="PlainTable4">
+    <w:name w:val="Plain Table 4"/>
+    <w:basedOn w:val="TableNormal"/>
+    <w:uiPriority w:val="44"/>
+    <w:rsid w:val="00CD778B"/>
+    <w:pPr>
+      <w:spacing w:after="0" w:line="240" w:lineRule="auto"/>
+    </w:pPr>
+    <w:tblPr>
+      <w:tblStyleRowBandSize w:val="1"/>
+      <w:tblStyleColBandSize w:val="1"/>
+    </w:tblPr>
+    <w:tblStylePr w:type="firstRow">
+      <w:rPr>
+        <w:b/>
+        <w:bCs/>
+      </w:rPr>
+    </w:tblStylePr>
+    <w:tblStylePr w:type="lastRow">
+      <w:rPr>
+        <w:b/>
+        <w:bCs/>
+      </w:rPr>
+    </w:tblStylePr>
+    <w:tblStylePr w:type="firstCol">
+      <w:rPr>
+        <w:b/>
+        <w:bCs/>
+      </w:rPr>
+    </w:tblStylePr>
+    <w:tblStylePr w:type="lastCol">
+      <w:rPr>
+        <w:b/>
+        <w:bCs/>
+      </w:rPr>
+    </w:tblStylePr>
+    <w:tblStylePr w:type="band1Vert">
+      <w:tblPr/>
+      <w:tcPr>
+        <w:shd w:val="clear" w:color="auto" w:fill="F2F2F2" w:themeFill="background1" w:themeFillShade="F2"/>
+      </w:tcPr>
+    </w:tblStylePr>
+    <w:tblStylePr w:type="band1Horz">
+      <w:tblPr/>
+      <w:tcPr>
+        <w:shd w:val="clear" w:color="auto" w:fill="F2F2F2" w:themeFill="background1" w:themeFillShade="F2"/>
+      </w:tcPr>
+    </w:tblStylePr>
+  </w:style>
+  <w:style w:type="table" w:styleId="PlainTable1">
+    <w:name w:val="Plain Table 1"/>
+    <w:basedOn w:val="TableNormal"/>
+    <w:uiPriority w:val="41"/>
+    <w:rsid w:val="00CD778B"/>
+    <w:pPr>
+      <w:spacing w:after="0" w:line="240" w:lineRule="auto"/>
+    </w:pPr>
+    <w:tblPr>
+      <w:tblStyleRowBandSize w:val="1"/>
+      <w:tblStyleColBandSize w:val="1"/>
+      <w:tblBorders>
+        <w:top w:val="single" w:sz="4" w:space="0" w:color="BFBFBF" w:themeColor="background1" w:themeShade="BF"/>
+        <w:left w:val="single" w:sz="4" w:space="0" w:color="BFBFBF" w:themeColor="background1" w:themeShade="BF"/>
+        <w:bottom w:val="single" w:sz="4" w:space="0" w:color="BFBFBF" w:themeColor="background1" w:themeShade="BF"/>
+        <w:right w:val="single" w:sz="4" w:space="0" w:color="BFBFBF" w:themeColor="background1" w:themeShade="BF"/>
+        <w:insideH w:val="single" w:sz="4" w:space="0" w:color="BFBFBF" w:themeColor="background1" w:themeShade="BF"/>
+        <w:insideV w:val="single" w:sz="4" w:space="0" w:color="BFBFBF" w:themeColor="background1" w:themeShade="BF"/>
+      </w:tblBorders>
+    </w:tblPr>
+    <w:tblStylePr w:type="firstRow">
+      <w:rPr>
+        <w:b/>
+        <w:bCs/>
+      </w:rPr>
+    </w:tblStylePr>
+    <w:tblStylePr w:type="lastRow">
+      <w:rPr>
+        <w:b/>
+        <w:bCs/>
+      </w:rPr>
+      <w:tblPr/>
+      <w:tcPr>
+        <w:tcBorders>
+          <w:top w:val="double" w:sz="4" w:space="0" w:color="BFBFBF" w:themeColor="background1" w:themeShade="BF"/>
+        </w:tcBorders>
+      </w:tcPr>
+    </w:tblStylePr>
+    <w:tblStylePr w:type="firstCol">
+      <w:rPr>
+        <w:b/>
+        <w:bCs/>
+      </w:rPr>
+    </w:tblStylePr>
+    <w:tblStylePr w:type="lastCol">
+      <w:rPr>
+        <w:b/>
+        <w:bCs/>
+      </w:rPr>
+    </w:tblStylePr>
+    <w:tblStylePr w:type="band1Vert">
+      <w:tblPr/>
+      <w:tcPr>
+        <w:shd w:val="clear" w:color="auto" w:fill="F2F2F2" w:themeFill="background1" w:themeFillShade="F2"/>
+      </w:tcPr>
+    </w:tblStylePr>
+    <w:tblStylePr w:type="band1Horz">
+      <w:tblPr/>
+      <w:tcPr>
+        <w:shd w:val="clear" w:color="auto" w:fill="F2F2F2" w:themeFill="background1" w:themeFillShade="F2"/>
+      </w:tcPr>
+    </w:tblStylePr>
+  </w:style>
+  <w:style w:type="table" w:styleId="PlainTable5">
+    <w:name w:val="Plain Table 5"/>
+    <w:basedOn w:val="TableNormal"/>
+    <w:uiPriority w:val="45"/>
+    <w:rsid w:val="00763E1E"/>
+    <w:pPr>
+      <w:spacing w:after="0" w:line="240" w:lineRule="auto"/>
+    </w:pPr>
+    <w:tblPr>
+      <w:tblStyleRowBandSize w:val="1"/>
+      <w:tblStyleColBandSize w:val="1"/>
+    </w:tblPr>
+    <w:tblStylePr w:type="firstRow">
+      <w:rPr>
+        <w:rFonts w:asciiTheme="majorHAnsi" w:eastAsiaTheme="majorEastAsia" w:hAnsiTheme="majorHAnsi" w:cstheme="majorBidi"/>
+        <w:i/>
+        <w:iCs/>
+        <w:sz w:val="26"/>
+      </w:rPr>
+      <w:tblPr/>
+      <w:tcPr>
+        <w:tcBorders>
+          <w:bottom w:val="single" w:sz="4" w:space="0" w:color="7F7F7F" w:themeColor="text1" w:themeTint="80"/>
+        </w:tcBorders>
+        <w:shd w:val="clear" w:color="auto" w:fill="FFFFFF" w:themeFill="background1"/>
+      </w:tcPr>
+    </w:tblStylePr>
+    <w:tblStylePr w:type="lastRow">
+      <w:rPr>
+        <w:rFonts w:asciiTheme="majorHAnsi" w:eastAsiaTheme="majorEastAsia" w:hAnsiTheme="majorHAnsi" w:cstheme="majorBidi"/>
+        <w:i/>
+        <w:iCs/>
+        <w:sz w:val="26"/>
+      </w:rPr>
+      <w:tblPr/>
+      <w:tcPr>
+        <w:tcBorders>
+          <w:top w:val="single" w:sz="4" w:space="0" w:color="7F7F7F" w:themeColor="text1" w:themeTint="80"/>
+        </w:tcBorders>
+        <w:shd w:val="clear" w:color="auto" w:fill="FFFFFF" w:themeFill="background1"/>
+      </w:tcPr>
+    </w:tblStylePr>
+    <w:tblStylePr w:type="firstCol">
+      <w:pPr>
+        <w:jc w:val="right"/>
+      </w:pPr>
+      <w:rPr>
+        <w:rFonts w:asciiTheme="majorHAnsi" w:eastAsiaTheme="majorEastAsia" w:hAnsiTheme="majorHAnsi" w:cstheme="majorBidi"/>
+        <w:i/>
+        <w:iCs/>
+        <w:sz w:val="26"/>
+      </w:rPr>
+      <w:tblPr/>
+      <w:tcPr>
+        <w:tcBorders>
+          <w:right w:val="single" w:sz="4" w:space="0" w:color="7F7F7F" w:themeColor="text1" w:themeTint="80"/>
+        </w:tcBorders>
+        <w:shd w:val="clear" w:color="auto" w:fill="FFFFFF" w:themeFill="background1"/>
+      </w:tcPr>
+    </w:tblStylePr>
+    <w:tblStylePr w:type="lastCol">
+      <w:rPr>
+        <w:rFonts w:asciiTheme="majorHAnsi" w:eastAsiaTheme="majorEastAsia" w:hAnsiTheme="majorHAnsi" w:cstheme="majorBidi"/>
+        <w:i/>
+        <w:iCs/>
+        <w:sz w:val="26"/>
+      </w:rPr>
+      <w:tblPr/>
+      <w:tcPr>
+        <w:tcBorders>
+          <w:left w:val="single" w:sz="4" w:space="0" w:color="7F7F7F" w:themeColor="text1" w:themeTint="80"/>
+        </w:tcBorders>
+        <w:shd w:val="clear" w:color="auto" w:fill="FFFFFF" w:themeFill="background1"/>
+      </w:tcPr>
+    </w:tblStylePr>
+    <w:tblStylePr w:type="band1Vert">
+      <w:tblPr/>
+      <w:tcPr>
+        <w:shd w:val="clear" w:color="auto" w:fill="F2F2F2" w:themeFill="background1" w:themeFillShade="F2"/>
+      </w:tcPr>
+    </w:tblStylePr>
+    <w:tblStylePr w:type="band1Horz">
+      <w:tblPr/>
+      <w:tcPr>
+        <w:shd w:val="clear" w:color="auto" w:fill="F2F2F2" w:themeFill="background1" w:themeFillShade="F2"/>
+      </w:tcPr>
+    </w:tblStylePr>
+    <w:tblStylePr w:type="neCell">
+      <w:tblPr/>
+      <w:tcPr>
+        <w:tcBorders>
+          <w:left w:val="nil"/>
+        </w:tcBorders>
+      </w:tcPr>
+    </w:tblStylePr>
+    <w:tblStylePr w:type="nwCell">
+      <w:tblPr/>
+      <w:tcPr>
+        <w:tcBorders>
+          <w:right w:val="nil"/>
+        </w:tcBorders>
+      </w:tcPr>
+    </w:tblStylePr>
+    <w:tblStylePr w:type="seCell">
+      <w:tblPr/>
+      <w:tcPr>
+        <w:tcBorders>
+          <w:left w:val="nil"/>
+        </w:tcBorders>
+      </w:tcPr>
+    </w:tblStylePr>
+    <w:tblStylePr w:type="swCell">
+      <w:tblPr/>
+      <w:tcPr>
+        <w:tcBorders>
+          <w:right w:val="nil"/>
+        </w:tcBorders>
+      </w:tcPr>
+    </w:tblStylePr>
+  </w:style>
+  <w:style w:type="paragraph" w:styleId="Caption">
+    <w:name w:val="caption"/>
+    <w:basedOn w:val="Normal"/>
+    <w:next w:val="Normal"/>
+    <w:uiPriority w:val="35"/>
+    <w:unhideWhenUsed/>
+    <w:qFormat/>
+    <w:rsid w:val="003C565D"/>
+    <w:pPr>
+      <w:spacing w:after="200" w:line="240" w:lineRule="auto"/>
+    </w:pPr>
+    <w:rPr>
+      <w:i/>
+      <w:iCs/>
+      <w:color w:val="0E2841" w:themeColor="text2"/>
+      <w:sz w:val="18"/>
+      <w:szCs w:val="18"/>
+    </w:rPr>
   </w:style>
 </w:styles>
 </file>

</xml_diff>